<commit_message>
Deploying to gh-pages from @ Morrison-Lab/sds@7438d72834b3d11689197552aef8a80a0a8ce927 🚀
</commit_message>
<xml_diff>
--- a/estimator-properties-handout.docx
+++ b/estimator-properties-handout.docx
@@ -15,7 +15,7 @@
         <w:pStyle w:val="Date"/>
       </w:pPr>
       <w:r>
-        <w:t xml:space="preserve">Last modified: 2026-10-15 12:56:30 (PDT)</w:t>
+        <w:t xml:space="preserve">Last modified: 2026-10-15 13:11:03 (PDT)</w:t>
       </w:r>
     </w:p>
     <w:p>
@@ -61,7 +61,7 @@
         <w:t xml:space="preserve">and how small can the variance of an unbiased estimator be?</w:t>
       </w:r>
     </w:p>
-    <w:bookmarkStart w:id="37" w:name="sec-consistency"/>
+    <w:bookmarkStart w:id="35" w:name="sec-consistency"/>
     <w:p>
       <w:pPr>
         <w:pStyle w:val="Heading2"/>
@@ -70,7 +70,7 @@
         <w:t xml:space="preserve">1 Consistency</w:t>
       </w:r>
     </w:p>
-    <w:bookmarkStart w:id="15" w:name="def-consistent"/>
+    <w:bookmarkStart w:id="12" w:name="def-consistent"/>
     <w:p>
       <w:pPr>
         <w:pStyle w:val="FirstParagraph"/>
@@ -471,127 +471,8 @@
         <w:t xml:space="preserve">.</w:t>
       </w:r>
     </w:p>
-    <w:tbl>
-      <w:tblPr>
-        <w:tblStyle w:val="Table"/>
-        <w:tblLook w:firstRow="0" w:lastRow="0" w:firstColumn="0" w:lastColumn="0" w:noHBand="0" w:noVBand="0" w:val="0000"/>
-        <w:tblBorders>
-          <w:top w:val="single" w:sz="4" w:space="0" w:color="0758E5"/>
-          <w:left w:val="single" w:sz="24" w:space="0" w:color="0758E5"/>
-          <w:bottom w:val="single" w:sz="4" w:space="0" w:color="0758E5"/>
-          <w:right w:val="single" w:sz="4" w:space="0" w:color="0758E5"/>
-        </w:tblBorders>
-        <w:tblCellMar>
-          <w:left w:w="144" w:type="dxa"/>
-          <w:right w:w="144" w:type="dxa"/>
-        </w:tblCellMar>
-        <w:tblLook w:firstRow="0" w:lastRow="0" w:firstColumn="0" w:lastColumn="0" w:noHBand="0" w:noVBand="0" w:val="0000"/>
-      </w:tblPr>
-      <w:tr>
-        <w:trPr>
-          <w:cantSplit/>
-        </w:trPr>
-        <w:tc>
-          <w:tcPr>
-            <w:shd w:color="auto" w:fill="dae6fb" w:val="clear"/>
-            <w:tcMar>
-              <w:top w:w="92" w:type="dxa"/>
-              <w:bottom w:w="92" w:type="dxa"/>
-            </w:tcMar>
-          </w:tcPr>
-          <w:p>
-            <w:pPr>
-              <w:pStyle w:val="BodyText"/>
-            </w:pPr>
-            <w:pPr>
-              <w:spacing w:before="0" w:after="0"/>
-              <w:textAlignment w:val="center"/>
-            </w:pPr>
-            <w:r>
-              <w:drawing>
-                <wp:inline>
-                  <wp:extent cx="152400" cy="152400"/>
-                  <wp:effectExtent b="0" l="0" r="0" t="0"/>
-                  <wp:docPr descr="" title="" id="13" name="Picture"/>
-                  <a:graphic>
-                    <a:graphicData uri="http://schemas.openxmlformats.org/drawingml/2006/picture">
-                      <pic:pic>
-                        <pic:nvPicPr>
-                          <pic:cNvPr descr="/opt/quarto/share/formats/docx/note.png" id="14" name="Picture"/>
-                          <pic:cNvPicPr>
-                            <a:picLocks noChangeArrowheads="1" noChangeAspect="1"/>
-                          </pic:cNvPicPr>
-                        </pic:nvPicPr>
-                        <pic:blipFill>
-                          <a:blip r:embed="rId12"/>
-                          <a:stretch>
-                            <a:fillRect/>
-                          </a:stretch>
-                        </pic:blipFill>
-                        <pic:spPr bwMode="auto">
-                          <a:xfrm>
-                            <a:off x="0" y="0"/>
-                            <a:ext cx="152400" cy="152400"/>
-                          </a:xfrm>
-                          <a:prstGeom prst="rect">
-                            <a:avLst/>
-                          </a:prstGeom>
-                          <a:noFill/>
-                          <a:ln w="9525">
-                            <a:noFill/>
-                            <a:headEnd/>
-                            <a:tailEnd/>
-                          </a:ln>
-                        </pic:spPr>
-                      </pic:pic>
-                    </a:graphicData>
-                  </a:graphic>
-                </wp:inline>
-              </w:drawing>
-            </w:r>
-            <w:r>
-              <w:t xml:space="preserve"> </w:t>
-            </w:r>
-            <w:r>
-              <w:t xml:space="preserve"> </w:t>
-            </w:r>
-            <w:r>
-              <w:t xml:space="preserve">Source</w:t>
-            </w:r>
-          </w:p>
-        </w:tc>
-      </w:tr>
-      <w:tr>
-        <w:trPr>
-          <w:cantSplit/>
-        </w:trPr>
-        <w:tc>
-          <w:tcPr>
-            <w:tcMar>
-              <w:top w:w="108" w:type="dxa"/>
-              <w:bottom w:w="108" w:type="dxa"/>
-            </w:tcMar>
-          </w:tcPr>
-          <w:p>
-            <w:pPr>
-              <w:pStyle w:val="BodyText"/>
-            </w:pPr>
-            <w:pPr>
-              <w:spacing w:before="16" w:after="16"/>
-            </w:pPr>
-            <w:r>
-              <w:t xml:space="preserve">Casella and Berger (2002, Def. 10.1.1)</w:t>
-            </w:r>
-            <w:r>
-              <w:t xml:space="preserve">.</w:t>
-            </w:r>
-          </w:p>
-          <w:p/>
-        </w:tc>
-      </w:tr>
-    </w:tbl>
-    <w:bookmarkEnd w:id="15"/>
-    <w:bookmarkStart w:id="19" w:name="rem-consistent-sequence"/>
+    <w:bookmarkEnd w:id="12"/>
+    <w:bookmarkStart w:id="13" w:name="rem-source-consistent"/>
     <w:p>
       <w:pPr>
         <w:pStyle w:val="BodyText"/>
@@ -604,6 +485,29 @@
         <w:t xml:space="preserve">Remark 1</w:t>
       </w:r>
       <w:r>
+        <w:t xml:space="preserve"> (Source: Consistent estimator). </w:t>
+      </w:r>
+      <w:r>
+        <w:t xml:space="preserve">Casella and Berger (2002, Def. 10.1.1)</w:t>
+      </w:r>
+      <w:r>
+        <w:t xml:space="preserve">.</w:t>
+      </w:r>
+    </w:p>
+    <w:bookmarkEnd w:id="13"/>
+    <w:bookmarkStart w:id="17" w:name="rem-consistent-sequence"/>
+    <w:p>
+      <w:pPr>
+        <w:pStyle w:val="BodyText"/>
+      </w:pPr>
+      <w:r>
+        <w:rPr>
+          <w:i/>
+          <w:iCs/>
+        </w:rPr>
+        <w:t xml:space="preserve">Remark 2</w:t>
+      </w:r>
+      <w:r>
         <w:t xml:space="preserve"> (Consistency describes a sequence of estimators). </w:t>
       </w:r>
       <w:r>
@@ -612,7 +516,7 @@
       <w:r>
         <w:t xml:space="preserve"> </w:t>
       </w:r>
-      <w:hyperlink r:id="rId16">
+      <w:hyperlink r:id="rId14">
         <w:r>
           <w:rPr>
             <w:rStyle w:val="Hyperlink"/>
@@ -719,7 +623,7 @@
       <w:r>
         <w:t xml:space="preserve"> </w:t>
       </w:r>
-      <w:hyperlink r:id="rId17">
+      <w:hyperlink r:id="rId15">
         <w:r>
           <w:rPr>
             <w:rStyle w:val="Hyperlink"/>
@@ -736,7 +640,7 @@
       <w:r>
         <w:t xml:space="preserve"> </w:t>
       </w:r>
-      <w:hyperlink r:id="rId18">
+      <w:hyperlink r:id="rId16">
         <w:r>
           <w:rPr>
             <w:rStyle w:val="Hyperlink"/>
@@ -837,8 +741,8 @@
         <w:t xml:space="preserve">of a mean is the standard example).</w:t>
       </w:r>
     </w:p>
-    <w:bookmarkEnd w:id="19"/>
-    <w:bookmarkStart w:id="21" w:name="exr-estimation-error-bound"/>
+    <w:bookmarkEnd w:id="17"/>
+    <w:bookmarkStart w:id="19" w:name="exr-estimation-error-bound"/>
     <w:p>
       <w:pPr>
         <w:pStyle w:val="BodyText"/>
@@ -894,7 +798,7 @@
       <w:r>
         <w:t xml:space="preserve"> </w:t>
       </w:r>
-      <w:hyperlink r:id="rId18">
+      <w:hyperlink r:id="rId16">
         <w:r>
           <w:rPr>
             <w:rStyle w:val="Hyperlink"/>
@@ -940,7 +844,7 @@
       <w:r>
         <w:t xml:space="preserve"> </w:t>
       </w:r>
-      <w:hyperlink r:id="rId20">
+      <w:hyperlink r:id="rId18">
         <w:r>
           <w:rPr>
             <w:rStyle w:val="Hyperlink"/>
@@ -1085,8 +989,8 @@
         <w:t xml:space="preserve">.</w:t>
       </w:r>
     </w:p>
-    <w:bookmarkEnd w:id="21"/>
-    <w:bookmarkStart w:id="22" w:name="sol-estimation-error-bound"/>
+    <w:bookmarkEnd w:id="19"/>
+    <w:bookmarkStart w:id="20" w:name="sol-estimation-error-bound"/>
     <w:p>
       <w:pPr>
         <w:pStyle w:val="BodyText"/>
@@ -1796,8 +1700,8 @@
         </m:oMath>
       </m:oMathPara>
     </w:p>
-    <w:bookmarkEnd w:id="22"/>
-    <w:bookmarkStart w:id="24" w:name="lem-estimation-error-bound"/>
+    <w:bookmarkEnd w:id="20"/>
+    <w:bookmarkStart w:id="22" w:name="lem-estimation-error-bound"/>
     <w:p>
       <w:pPr>
         <w:pStyle w:val="FirstParagraph"/>
@@ -1930,7 +1834,7 @@
       <w:pPr>
         <w:pStyle w:val="BodyText"/>
       </w:pPr>
-      <w:bookmarkStart w:id="23" w:name="eq-estimation-error-bound"/>
+      <w:bookmarkStart w:id="21" w:name="eq-estimation-error-bound"/>
       <m:oMathPara>
         <m:oMathParaPr>
           <m:jc m:val="center"/>
@@ -2081,9 +1985,9 @@
           </m:r>
         </m:oMath>
       </m:oMathPara>
-      <w:bookmarkEnd w:id="23"/>
+      <w:bookmarkEnd w:id="21"/>
     </w:p>
-    <w:bookmarkEnd w:id="24"/>
+    <w:bookmarkEnd w:id="22"/>
     <w:p>
       <w:pPr>
         <w:pStyle w:val="FirstParagraph"/>
@@ -2116,7 +2020,7 @@
         <w:t xml:space="preserve">.</w:t>
       </w:r>
     </w:p>
-    <w:bookmarkStart w:id="26" w:name="thm-mse-consistent"/>
+    <w:bookmarkStart w:id="24" w:name="thm-mse-consistent"/>
     <w:p>
       <w:pPr>
         <w:pStyle w:val="BodyText"/>
@@ -2247,7 +2151,7 @@
       <w:pPr>
         <w:pStyle w:val="BodyText"/>
       </w:pPr>
-      <w:bookmarkStart w:id="25" w:name="eq-mse-consistent"/>
+      <w:bookmarkStart w:id="23" w:name="eq-mse-consistent"/>
       <m:oMathPara>
         <m:oMathParaPr>
           <m:jc m:val="center"/>
@@ -2399,9 +2303,9 @@
           </m:r>
         </m:oMath>
       </m:oMathPara>
-      <w:bookmarkEnd w:id="25"/>
+      <w:bookmarkEnd w:id="23"/>
     </w:p>
-    <w:bookmarkEnd w:id="26"/>
+    <w:bookmarkEnd w:id="24"/>
     <w:p>
       <w:pPr>
         <w:pStyle w:val="FirstParagraph"/>
@@ -2784,7 +2688,7 @@
         <w:t xml:space="preserve">.</w:t>
       </w:r>
     </w:p>
-    <w:bookmarkStart w:id="27" w:name="cor-sample-mean-consistent"/>
+    <w:bookmarkStart w:id="25" w:name="cor-sample-mean-consistent"/>
     <w:p>
       <w:pPr>
         <w:pStyle w:val="BodyText"/>
@@ -2969,7 +2873,7 @@
         <w:t xml:space="preserve">.</w:t>
       </w:r>
     </w:p>
-    <w:bookmarkEnd w:id="27"/>
+    <w:bookmarkEnd w:id="25"/>
     <w:p>
       <w:pPr>
         <w:pStyle w:val="BodyText"/>
@@ -2990,7 +2894,7 @@
       <w:r>
         <w:t xml:space="preserve"> </w:t>
       </w:r>
-      <w:hyperlink r:id="rId28">
+      <w:hyperlink r:id="rId26">
         <w:r>
           <w:rPr>
             <w:rStyle w:val="Hyperlink"/>
@@ -3177,7 +3081,7 @@
       <w:r>
         <w:t xml:space="preserve"> </w:t>
       </w:r>
-      <w:hyperlink r:id="rId29">
+      <w:hyperlink r:id="rId27">
         <w:r>
           <w:rPr>
             <w:rStyle w:val="Hyperlink"/>
@@ -3195,7 +3099,7 @@
         <w:t xml:space="preserve">proved in pds directly from Chebyshev’s inequality.</w:t>
       </w:r>
     </w:p>
-    <w:bookmarkStart w:id="36" w:name="exm-consistency-birthwt"/>
+    <w:bookmarkStart w:id="34" w:name="exm-consistency-birthwt"/>
     <w:p>
       <w:pPr>
         <w:pStyle w:val="BodyText"/>
@@ -3246,7 +3150,7 @@
       <w:r>
         <w:t xml:space="preserve"> </w:t>
       </w:r>
-      <w:hyperlink r:id="rId30">
+      <w:hyperlink r:id="rId28">
         <w:r>
           <w:rPr>
             <w:rStyle w:val="VerbatimChar"/>
@@ -3278,7 +3182,7 @@
       <w:r>
         <w:t xml:space="preserve"> </w:t>
       </w:r>
-      <w:hyperlink r:id="rId31">
+      <w:hyperlink r:id="rId29">
         <w:r>
           <w:rPr>
             <w:rStyle w:val="VerbatimChar"/>
@@ -3626,7 +3530,7 @@
       <w:r>
         <w:t xml:space="preserve"> </w:t>
       </w:r>
-      <w:hyperlink r:id="rId28">
+      <w:hyperlink r:id="rId26">
         <w:r>
           <w:rPr>
             <w:rStyle w:val="Hyperlink"/>
@@ -4835,7 +4739,7 @@
       <w:tr>
         <w:tc>
           <w:tcPr/>
-          <w:bookmarkStart w:id="35" w:name="fig-consistency-birthwt"/>
+          <w:bookmarkStart w:id="33" w:name="fig-consistency-birthwt"/>
           <w:p>
             <w:pPr>
               <w:pStyle w:val="SourceCode"/>
@@ -5535,18 +5439,18 @@
                 <wp:inline>
                   <wp:extent cx="4620126" cy="3696101"/>
                   <wp:effectExtent b="0" l="0" r="0" t="0"/>
-                  <wp:docPr descr="" title="" id="33" name="Picture"/>
+                  <wp:docPr descr="" title="" id="31" name="Picture"/>
                   <a:graphic>
                     <a:graphicData uri="http://schemas.openxmlformats.org/drawingml/2006/picture">
                       <pic:pic>
                         <pic:nvPicPr>
-                          <pic:cNvPr descr="estimator-properties_files/figure-docx/consistency-birthwt-plot-1.png" id="34" name="Picture"/>
+                          <pic:cNvPr descr="estimator-properties_files/figure-docx/consistency-birthwt-plot-1.png" id="32" name="Picture"/>
                           <pic:cNvPicPr>
                             <a:picLocks noChangeArrowheads="1" noChangeAspect="1"/>
                           </pic:cNvPicPr>
                         </pic:nvPicPr>
                         <pic:blipFill>
-                          <a:blip r:embed="rId32"/>
+                          <a:blip r:embed="rId30"/>
                           <a:stretch>
                             <a:fillRect/>
                           </a:stretch>
@@ -5628,7 +5532,7 @@
               </w:r>
             </w:hyperlink>
           </w:p>
-          <w:bookmarkEnd w:id="35"/>
+          <w:bookmarkEnd w:id="33"/>
         </w:tc>
       </w:tr>
     </w:tbl>
@@ -5709,9 +5613,9 @@
         <w:t xml:space="preserve">decay.</w:t>
       </w:r>
     </w:p>
-    <w:bookmarkEnd w:id="36"/>
-    <w:bookmarkEnd w:id="37"/>
-    <w:bookmarkStart w:id="45" w:name="sec-efficiency"/>
+    <w:bookmarkEnd w:id="34"/>
+    <w:bookmarkEnd w:id="35"/>
+    <w:bookmarkStart w:id="42" w:name="sec-efficiency"/>
     <w:p>
       <w:pPr>
         <w:pStyle w:val="Heading2"/>
@@ -5720,7 +5624,7 @@
         <w:t xml:space="preserve">2 Efficiency</w:t>
       </w:r>
     </w:p>
-    <w:bookmarkStart w:id="40" w:name="def-relative-efficiency"/>
+    <w:bookmarkStart w:id="36" w:name="def-relative-efficiency"/>
     <w:p>
       <w:pPr>
         <w:pStyle w:val="FirstParagraph"/>
@@ -5894,7 +5798,7 @@
       <w:r>
         <w:t xml:space="preserve"> </w:t>
       </w:r>
-      <w:hyperlink r:id="rId18">
+      <w:hyperlink r:id="rId16">
         <w:r>
           <w:rPr>
             <w:rStyle w:val="Hyperlink"/>
@@ -6042,136 +5946,40 @@
         </m:oMath>
       </m:oMathPara>
     </w:p>
-    <w:tbl>
-      <w:tblPr>
-        <w:tblStyle w:val="Table"/>
-        <w:tblLook w:firstRow="0" w:lastRow="0" w:firstColumn="0" w:lastColumn="0" w:noHBand="0" w:noVBand="0" w:val="0000"/>
-        <w:tblBorders>
-          <w:top w:val="single" w:sz="4" w:space="0" w:color="0758E5"/>
-          <w:left w:val="single" w:sz="24" w:space="0" w:color="0758E5"/>
-          <w:bottom w:val="single" w:sz="4" w:space="0" w:color="0758E5"/>
-          <w:right w:val="single" w:sz="4" w:space="0" w:color="0758E5"/>
-        </w:tblBorders>
-        <w:tblCellMar>
-          <w:left w:w="144" w:type="dxa"/>
-          <w:right w:w="144" w:type="dxa"/>
-        </w:tblCellMar>
-        <w:tblLook w:firstRow="0" w:lastRow="0" w:firstColumn="0" w:lastColumn="0" w:noHBand="0" w:noVBand="0" w:val="0000"/>
-      </w:tblPr>
-      <w:tr>
-        <w:trPr>
-          <w:cantSplit/>
-        </w:trPr>
-        <w:tc>
-          <w:tcPr>
-            <w:shd w:color="auto" w:fill="dae6fb" w:val="clear"/>
-            <w:tcMar>
-              <w:top w:w="92" w:type="dxa"/>
-              <w:bottom w:w="92" w:type="dxa"/>
-            </w:tcMar>
-          </w:tcPr>
-          <w:p>
-            <w:pPr>
-              <w:pStyle w:val="FirstParagraph"/>
-            </w:pPr>
-            <w:pPr>
-              <w:spacing w:before="0" w:after="0"/>
-              <w:textAlignment w:val="center"/>
-            </w:pPr>
-            <w:r>
-              <w:drawing>
-                <wp:inline>
-                  <wp:extent cx="152400" cy="152400"/>
-                  <wp:effectExtent b="0" l="0" r="0" t="0"/>
-                  <wp:docPr descr="" title="" id="38" name="Picture"/>
-                  <a:graphic>
-                    <a:graphicData uri="http://schemas.openxmlformats.org/drawingml/2006/picture">
-                      <pic:pic>
-                        <pic:nvPicPr>
-                          <pic:cNvPr descr="/opt/quarto/share/formats/docx/note.png" id="39" name="Picture"/>
-                          <pic:cNvPicPr>
-                            <a:picLocks noChangeArrowheads="1" noChangeAspect="1"/>
-                          </pic:cNvPicPr>
-                        </pic:nvPicPr>
-                        <pic:blipFill>
-                          <a:blip r:embed="rId12"/>
-                          <a:stretch>
-                            <a:fillRect/>
-                          </a:stretch>
-                        </pic:blipFill>
-                        <pic:spPr bwMode="auto">
-                          <a:xfrm>
-                            <a:off x="0" y="0"/>
-                            <a:ext cx="152400" cy="152400"/>
-                          </a:xfrm>
-                          <a:prstGeom prst="rect">
-                            <a:avLst/>
-                          </a:prstGeom>
-                          <a:noFill/>
-                          <a:ln w="9525">
-                            <a:noFill/>
-                            <a:headEnd/>
-                            <a:tailEnd/>
-                          </a:ln>
-                        </pic:spPr>
-                      </pic:pic>
-                    </a:graphicData>
-                  </a:graphic>
-                </wp:inline>
-              </w:drawing>
-            </w:r>
-            <w:r>
-              <w:t xml:space="preserve"> </w:t>
-            </w:r>
-            <w:r>
-              <w:t xml:space="preserve"> </w:t>
-            </w:r>
-            <w:r>
-              <w:t xml:space="preserve">Source</w:t>
-            </w:r>
-          </w:p>
-        </w:tc>
-      </w:tr>
-      <w:tr>
-        <w:trPr>
-          <w:cantSplit/>
-        </w:trPr>
-        <w:tc>
-          <w:tcPr>
-            <w:tcMar>
-              <w:top w:w="108" w:type="dxa"/>
-              <w:bottom w:w="108" w:type="dxa"/>
-            </w:tcMar>
-          </w:tcPr>
-          <w:p>
-            <w:pPr>
-              <w:pStyle w:val="BodyText"/>
-            </w:pPr>
-            <w:pPr>
-              <w:spacing w:before="16" w:after="16"/>
-            </w:pPr>
-            <w:r>
-              <w:t xml:space="preserve">Casella and Berger (2002)</w:t>
-            </w:r>
-            <w:r>
-              <w:t xml:space="preserve"> </w:t>
-            </w:r>
-            <w:r>
-              <w:t xml:space="preserve">define the asymptotic version, through variances, in Def. 10.1.16 (p. 476);</w:t>
-            </w:r>
-            <w:r>
-              <w:t xml:space="preserve"> </w:t>
-            </w:r>
-            <w:r>
-              <w:t xml:space="preserve">this finite-sample form uses the mean squared error of their Def. 7.3.1 (p. 330).</w:t>
-            </w:r>
-          </w:p>
-          <w:p/>
-        </w:tc>
-      </w:tr>
-    </w:tbl>
-    <w:bookmarkEnd w:id="40"/>
-    <w:bookmarkStart w:id="42" w:name="rem-relative-efficiency"/>
+    <w:bookmarkEnd w:id="36"/>
+    <w:bookmarkStart w:id="37" w:name="rem-source-relative-efficiency"/>
+    <w:p>
+      <w:pPr>
+        <w:pStyle w:val="FirstParagraph"/>
+      </w:pPr>
+      <w:r>
+        <w:rPr>
+          <w:i/>
+          <w:iCs/>
+        </w:rPr>
+        <w:t xml:space="preserve">Remark 3</w:t>
+      </w:r>
+      <w:r>
+        <w:t xml:space="preserve"> (Source: Relative efficiency). </w:t>
+      </w:r>
+      <w:r>
+        <w:t xml:space="preserve">Casella and Berger (2002)</w:t>
+      </w:r>
+      <w:r>
+        <w:t xml:space="preserve"> </w:t>
+      </w:r>
+      <w:r>
+        <w:t xml:space="preserve">define the asymptotic version, through variances, in Def. 10.1.16 (p. 476);</w:t>
+      </w:r>
+      <w:r>
+        <w:t xml:space="preserve"> </w:t>
+      </w:r>
+      <w:r>
+        <w:t xml:space="preserve">this finite-sample form uses the mean squared error of their Def. 7.3.1 (p. 330).</w:t>
+      </w:r>
+    </w:p>
+    <w:bookmarkEnd w:id="37"/>
+    <w:bookmarkStart w:id="39" w:name="rem-relative-efficiency"/>
     <w:p>
       <w:pPr>
         <w:pStyle w:val="BodyText"/>
@@ -6181,7 +5989,7 @@
           <w:i/>
           <w:iCs/>
         </w:rPr>
-        <w:t xml:space="preserve">Remark 2</w:t>
+        <w:t xml:space="preserve">Remark 4</w:t>
       </w:r>
       <w:r>
         <w:t xml:space="preserve"> (Reading the relative efficiency). </w:t>
@@ -6261,7 +6069,7 @@
       <w:r>
         <w:t xml:space="preserve"> </w:t>
       </w:r>
-      <w:hyperlink r:id="rId17">
+      <w:hyperlink r:id="rId15">
         <w:r>
           <w:rPr>
             <w:rStyle w:val="Hyperlink"/>
@@ -6281,7 +6089,7 @@
       <w:r>
         <w:t xml:space="preserve">(</w:t>
       </w:r>
-      <w:hyperlink r:id="rId41">
+      <w:hyperlink r:id="rId38">
         <w:r>
           <w:rPr>
             <w:rStyle w:val="Hyperlink"/>
@@ -6299,8 +6107,8 @@
         <w:t xml:space="preserve">so the relative efficiency is the ratio of the variances.</w:t>
       </w:r>
     </w:p>
-    <w:bookmarkEnd w:id="42"/>
-    <w:bookmarkStart w:id="44" w:name="exm-relative-efficiency-mean"/>
+    <w:bookmarkEnd w:id="39"/>
+    <w:bookmarkStart w:id="41" w:name="exm-relative-efficiency-mean"/>
     <w:p>
       <w:pPr>
         <w:pStyle w:val="BodyText"/>
@@ -6321,7 +6129,7 @@
       <w:r>
         <w:t xml:space="preserve"> </w:t>
       </w:r>
-      <w:hyperlink r:id="rId28">
+      <w:hyperlink r:id="rId26">
         <w:r>
           <w:rPr>
             <w:rStyle w:val="Hyperlink"/>
@@ -6934,7 +6742,7 @@
       <w:r>
         <w:t xml:space="preserve"> </w:t>
       </w:r>
-      <w:hyperlink r:id="rId43">
+      <w:hyperlink r:id="rId40">
         <w:r>
           <w:rPr>
             <w:rStyle w:val="Hyperlink"/>
@@ -6972,9 +6780,9 @@
         <w:t xml:space="preserve">.</w:t>
       </w:r>
     </w:p>
-    <w:bookmarkEnd w:id="44"/>
-    <w:bookmarkEnd w:id="45"/>
-    <w:bookmarkStart w:id="72" w:name="sec-cramer-rao"/>
+    <w:bookmarkEnd w:id="41"/>
+    <w:bookmarkEnd w:id="42"/>
+    <w:bookmarkStart w:id="67" w:name="sec-cramer-rao"/>
     <w:p>
       <w:pPr>
         <w:pStyle w:val="Heading2"/>
@@ -6983,7 +6791,7 @@
         <w:t xml:space="preserve">3 The Cramér–Rao lower bound</w:t>
       </w:r>
     </w:p>
-    <w:bookmarkStart w:id="48" w:name="exr-cov-estimator-score"/>
+    <w:bookmarkStart w:id="45" w:name="exr-cov-estimator-score"/>
     <w:p>
       <w:pPr>
         <w:pStyle w:val="FirstParagraph"/>
@@ -7090,7 +6898,7 @@
       <w:r>
         <w:t xml:space="preserve"> </w:t>
       </w:r>
-      <w:hyperlink r:id="rId46">
+      <w:hyperlink r:id="rId43">
         <w:r>
           <w:rPr>
             <w:rStyle w:val="Hyperlink"/>
@@ -7169,7 +6977,7 @@
       <w:r>
         <w:t xml:space="preserve"> </w:t>
       </w:r>
-      <w:hyperlink r:id="rId17">
+      <w:hyperlink r:id="rId15">
         <w:r>
           <w:rPr>
             <w:rStyle w:val="Hyperlink"/>
@@ -7227,7 +7035,7 @@
       <w:r>
         <w:t xml:space="preserve"> </w:t>
       </w:r>
-      <w:hyperlink r:id="rId47">
+      <w:hyperlink r:id="rId44">
         <w:r>
           <w:rPr>
             <w:rStyle w:val="Hyperlink"/>
@@ -7356,8 +7164,8 @@
         <w:t xml:space="preserve">can be taken inside the integral.</w:t>
       </w:r>
     </w:p>
-    <w:bookmarkEnd w:id="48"/>
-    <w:bookmarkStart w:id="50" w:name="sol-cov-estimator-score"/>
+    <w:bookmarkEnd w:id="45"/>
+    <w:bookmarkStart w:id="47" w:name="sol-cov-estimator-score"/>
     <w:p>
       <w:pPr>
         <w:pStyle w:val="BodyText"/>
@@ -7378,7 +7186,7 @@
       <w:r>
         <w:t xml:space="preserve"> </w:t>
       </w:r>
-      <w:hyperlink r:id="rId46">
+      <w:hyperlink r:id="rId43">
         <w:r>
           <w:rPr>
             <w:rStyle w:val="Hyperlink"/>
@@ -7398,7 +7206,7 @@
       <w:r>
         <w:t xml:space="preserve"> </w:t>
       </w:r>
-      <w:hyperlink r:id="rId49">
+      <w:hyperlink r:id="rId46">
         <w:r>
           <w:rPr>
             <w:rStyle w:val="Hyperlink"/>
@@ -8795,8 +8603,8 @@
         </m:oMath>
       </m:oMathPara>
     </w:p>
-    <w:bookmarkEnd w:id="50"/>
-    <w:bookmarkStart w:id="52" w:name="lem-cov-estimator-score"/>
+    <w:bookmarkEnd w:id="47"/>
+    <w:bookmarkStart w:id="49" w:name="lem-cov-estimator-score"/>
     <w:p>
       <w:pPr>
         <w:pStyle w:val="FirstParagraph"/>
@@ -8874,7 +8682,7 @@
       <w:pPr>
         <w:pStyle w:val="BodyText"/>
       </w:pPr>
-      <w:bookmarkStart w:id="51" w:name="eq-cov-estimator-score"/>
+      <w:bookmarkStart w:id="48" w:name="eq-cov-estimator-score"/>
       <m:oMathPara>
         <m:oMathParaPr>
           <m:jc m:val="center"/>
@@ -8993,9 +8801,9 @@
           </m:r>
         </m:oMath>
       </m:oMathPara>
-      <w:bookmarkEnd w:id="51"/>
+      <w:bookmarkEnd w:id="48"/>
     </w:p>
-    <w:bookmarkEnd w:id="52"/>
+    <w:bookmarkEnd w:id="49"/>
     <w:p>
       <w:pPr>
         <w:pStyle w:val="FirstParagraph"/>
@@ -9028,7 +8836,7 @@
         <w:t xml:space="preserve">.</w:t>
       </w:r>
     </w:p>
-    <w:bookmarkStart w:id="57" w:name="thm-cramer-rao"/>
+    <w:bookmarkStart w:id="52" w:name="thm-cramer-rao"/>
     <w:p>
       <w:pPr>
         <w:pStyle w:val="BodyText"/>
@@ -9069,7 +8877,7 @@
       <w:r>
         <w:t xml:space="preserve"> </w:t>
       </w:r>
-      <w:hyperlink r:id="rId53">
+      <w:hyperlink r:id="rId50">
         <w:r>
           <w:rPr>
             <w:rStyle w:val="Hyperlink"/>
@@ -9186,7 +8994,7 @@
       <w:pPr>
         <w:pStyle w:val="BodyText"/>
       </w:pPr>
-      <w:bookmarkStart w:id="54" w:name="eq-cramer-rao"/>
+      <w:bookmarkStart w:id="51" w:name="eq-cramer-rao"/>
       <m:oMathPara>
         <m:oMathParaPr>
           <m:jc m:val="center"/>
@@ -9284,149 +9092,12 @@
           </m:r>
         </m:oMath>
       </m:oMathPara>
-      <w:bookmarkEnd w:id="54"/>
+      <w:bookmarkEnd w:id="51"/>
     </w:p>
-    <w:tbl>
-      <w:tblPr>
-        <w:tblStyle w:val="Table"/>
-        <w:tblLook w:firstRow="0" w:lastRow="0" w:firstColumn="0" w:lastColumn="0" w:noHBand="0" w:noVBand="0" w:val="0000"/>
-        <w:tblBorders>
-          <w:top w:val="single" w:sz="4" w:space="0" w:color="0758E5"/>
-          <w:left w:val="single" w:sz="24" w:space="0" w:color="0758E5"/>
-          <w:bottom w:val="single" w:sz="4" w:space="0" w:color="0758E5"/>
-          <w:right w:val="single" w:sz="4" w:space="0" w:color="0758E5"/>
-        </w:tblBorders>
-        <w:tblCellMar>
-          <w:left w:w="144" w:type="dxa"/>
-          <w:right w:w="144" w:type="dxa"/>
-        </w:tblCellMar>
-        <w:tblLook w:firstRow="0" w:lastRow="0" w:firstColumn="0" w:lastColumn="0" w:noHBand="0" w:noVBand="0" w:val="0000"/>
-      </w:tblPr>
-      <w:tr>
-        <w:trPr>
-          <w:cantSplit/>
-        </w:trPr>
-        <w:tc>
-          <w:tcPr>
-            <w:shd w:color="auto" w:fill="dae6fb" w:val="clear"/>
-            <w:tcMar>
-              <w:top w:w="92" w:type="dxa"/>
-              <w:bottom w:w="92" w:type="dxa"/>
-            </w:tcMar>
-          </w:tcPr>
-          <w:p>
-            <w:pPr>
-              <w:pStyle w:val="FirstParagraph"/>
-            </w:pPr>
-            <w:pPr>
-              <w:spacing w:before="0" w:after="0"/>
-              <w:textAlignment w:val="center"/>
-            </w:pPr>
-            <w:r>
-              <w:drawing>
-                <wp:inline>
-                  <wp:extent cx="152400" cy="152400"/>
-                  <wp:effectExtent b="0" l="0" r="0" t="0"/>
-                  <wp:docPr descr="" title="" id="55" name="Picture"/>
-                  <a:graphic>
-                    <a:graphicData uri="http://schemas.openxmlformats.org/drawingml/2006/picture">
-                      <pic:pic>
-                        <pic:nvPicPr>
-                          <pic:cNvPr descr="/opt/quarto/share/formats/docx/note.png" id="56" name="Picture"/>
-                          <pic:cNvPicPr>
-                            <a:picLocks noChangeArrowheads="1" noChangeAspect="1"/>
-                          </pic:cNvPicPr>
-                        </pic:nvPicPr>
-                        <pic:blipFill>
-                          <a:blip r:embed="rId12"/>
-                          <a:stretch>
-                            <a:fillRect/>
-                          </a:stretch>
-                        </pic:blipFill>
-                        <pic:spPr bwMode="auto">
-                          <a:xfrm>
-                            <a:off x="0" y="0"/>
-                            <a:ext cx="152400" cy="152400"/>
-                          </a:xfrm>
-                          <a:prstGeom prst="rect">
-                            <a:avLst/>
-                          </a:prstGeom>
-                          <a:noFill/>
-                          <a:ln w="9525">
-                            <a:noFill/>
-                            <a:headEnd/>
-                            <a:tailEnd/>
-                          </a:ln>
-                        </pic:spPr>
-                      </pic:pic>
-                    </a:graphicData>
-                  </a:graphic>
-                </wp:inline>
-              </w:drawing>
-            </w:r>
-            <w:r>
-              <w:t xml:space="preserve"> </w:t>
-            </w:r>
-            <w:r>
-              <w:t xml:space="preserve"> </w:t>
-            </w:r>
-            <w:r>
-              <w:t xml:space="preserve">Source</w:t>
-            </w:r>
-          </w:p>
-        </w:tc>
-      </w:tr>
-      <w:tr>
-        <w:trPr>
-          <w:cantSplit/>
-        </w:trPr>
-        <w:tc>
-          <w:tcPr>
-            <w:tcMar>
-              <w:top w:w="108" w:type="dxa"/>
-              <w:bottom w:w="108" w:type="dxa"/>
-            </w:tcMar>
-          </w:tcPr>
-          <w:p>
-            <w:pPr>
-              <w:pStyle w:val="BodyText"/>
-            </w:pPr>
-            <w:pPr>
-              <w:spacing w:before="16" w:after="16"/>
-            </w:pPr>
-            <w:r>
-              <w:t xml:space="preserve">Rao (1945)</w:t>
-            </w:r>
-            <w:r>
-              <w:t xml:space="preserve">;</w:t>
-            </w:r>
-            <w:r>
-              <w:t xml:space="preserve"> </w:t>
-            </w:r>
-            <w:r>
-              <w:t xml:space="preserve">Cramér (1946)</w:t>
-            </w:r>
-            <w:r>
-              <w:t xml:space="preserve">;</w:t>
-            </w:r>
-            <w:r>
-              <w:t xml:space="preserve"> </w:t>
-            </w:r>
-            <w:r>
-              <w:t xml:space="preserve">Casella and Berger (2002, Thm. 7.3.9, p. 335)</w:t>
-            </w:r>
-            <w:r>
-              <w:t xml:space="preserve">.</w:t>
-            </w:r>
-          </w:p>
-          <w:p/>
-        </w:tc>
-      </w:tr>
-    </w:tbl>
-    <w:bookmarkEnd w:id="57"/>
+    <w:bookmarkEnd w:id="52"/>
     <w:p>
       <w:pPr>
-        <w:pStyle w:val="BodyText"/>
+        <w:pStyle w:val="FirstParagraph"/>
       </w:pPr>
       <w:r>
         <w:rPr>
@@ -9486,7 +9157,7 @@
       <w:r>
         <w:t xml:space="preserve"> </w:t>
       </w:r>
-      <w:hyperlink r:id="rId58">
+      <w:hyperlink r:id="rId53">
         <w:r>
           <w:rPr>
             <w:rStyle w:val="Hyperlink"/>
@@ -9660,7 +9331,7 @@
       <w:r>
         <w:t xml:space="preserve"> </w:t>
       </w:r>
-      <w:hyperlink r:id="rId59">
+      <w:hyperlink r:id="rId54">
         <w:r>
           <w:rPr>
             <w:rStyle w:val="Hyperlink"/>
@@ -9704,7 +9375,7 @@
       <w:r>
         <w:t xml:space="preserve"> </w:t>
       </w:r>
-      <w:hyperlink r:id="rId60">
+      <w:hyperlink r:id="rId55">
         <w:r>
           <w:rPr>
             <w:rStyle w:val="Hyperlink"/>
@@ -10411,13 +10082,54 @@
         <w:t xml:space="preserve">.</w:t>
       </w:r>
     </w:p>
-    <w:bookmarkStart w:id="63" w:name="def-efficient"/>
+    <w:bookmarkStart w:id="56" w:name="rem-source-cramer-rao"/>
     <w:p>
       <w:pPr>
         <w:pStyle w:val="BodyText"/>
       </w:pPr>
       <w:r>
         <w:rPr>
+          <w:i/>
+          <w:iCs/>
+        </w:rPr>
+        <w:t xml:space="preserve">Remark 5</w:t>
+      </w:r>
+      <w:r>
+        <w:t xml:space="preserve"> (Source: Cramér–Rao lower bound). </w:t>
+      </w:r>
+      <w:r>
+        <w:t xml:space="preserve">Rao (1945)</w:t>
+      </w:r>
+      <w:r>
+        <w:t xml:space="preserve">;</w:t>
+      </w:r>
+      <w:r>
+        <w:t xml:space="preserve"> </w:t>
+      </w:r>
+      <w:r>
+        <w:t xml:space="preserve">Cramér (1946)</w:t>
+      </w:r>
+      <w:r>
+        <w:t xml:space="preserve">;</w:t>
+      </w:r>
+      <w:r>
+        <w:t xml:space="preserve"> </w:t>
+      </w:r>
+      <w:r>
+        <w:t xml:space="preserve">Casella and Berger (2002, Thm. 7.3.9, p. 335)</w:t>
+      </w:r>
+      <w:r>
+        <w:t xml:space="preserve">.</w:t>
+      </w:r>
+    </w:p>
+    <w:bookmarkEnd w:id="56"/>
+    <w:bookmarkStart w:id="57" w:name="def-efficient"/>
+    <w:p>
+      <w:pPr>
+        <w:pStyle w:val="BodyText"/>
+      </w:pPr>
+      <w:r>
+        <w:rPr>
           <w:b/>
           <w:bCs/>
         </w:rPr>
@@ -10432,7 +10144,7 @@
       <w:r>
         <w:t xml:space="preserve"> </w:t>
       </w:r>
-      <w:hyperlink r:id="rId17">
+      <w:hyperlink r:id="rId15">
         <w:r>
           <w:rPr>
             <w:rStyle w:val="Hyperlink"/>
@@ -10596,127 +10308,31 @@
         </m:oMath>
       </m:oMathPara>
     </w:p>
-    <w:tbl>
-      <w:tblPr>
-        <w:tblStyle w:val="Table"/>
-        <w:tblLook w:firstRow="0" w:lastRow="0" w:firstColumn="0" w:lastColumn="0" w:noHBand="0" w:noVBand="0" w:val="0000"/>
-        <w:tblBorders>
-          <w:top w:val="single" w:sz="4" w:space="0" w:color="0758E5"/>
-          <w:left w:val="single" w:sz="24" w:space="0" w:color="0758E5"/>
-          <w:bottom w:val="single" w:sz="4" w:space="0" w:color="0758E5"/>
-          <w:right w:val="single" w:sz="4" w:space="0" w:color="0758E5"/>
-        </w:tblBorders>
-        <w:tblCellMar>
-          <w:left w:w="144" w:type="dxa"/>
-          <w:right w:w="144" w:type="dxa"/>
-        </w:tblCellMar>
-        <w:tblLook w:firstRow="0" w:lastRow="0" w:firstColumn="0" w:lastColumn="0" w:noHBand="0" w:noVBand="0" w:val="0000"/>
-      </w:tblPr>
-      <w:tr>
-        <w:trPr>
-          <w:cantSplit/>
-        </w:trPr>
-        <w:tc>
-          <w:tcPr>
-            <w:shd w:color="auto" w:fill="dae6fb" w:val="clear"/>
-            <w:tcMar>
-              <w:top w:w="92" w:type="dxa"/>
-              <w:bottom w:w="92" w:type="dxa"/>
-            </w:tcMar>
-          </w:tcPr>
-          <w:p>
-            <w:pPr>
-              <w:pStyle w:val="FirstParagraph"/>
-            </w:pPr>
-            <w:pPr>
-              <w:spacing w:before="0" w:after="0"/>
-              <w:textAlignment w:val="center"/>
-            </w:pPr>
-            <w:r>
-              <w:drawing>
-                <wp:inline>
-                  <wp:extent cx="152400" cy="152400"/>
-                  <wp:effectExtent b="0" l="0" r="0" t="0"/>
-                  <wp:docPr descr="" title="" id="61" name="Picture"/>
-                  <a:graphic>
-                    <a:graphicData uri="http://schemas.openxmlformats.org/drawingml/2006/picture">
-                      <pic:pic>
-                        <pic:nvPicPr>
-                          <pic:cNvPr descr="/opt/quarto/share/formats/docx/note.png" id="62" name="Picture"/>
-                          <pic:cNvPicPr>
-                            <a:picLocks noChangeArrowheads="1" noChangeAspect="1"/>
-                          </pic:cNvPicPr>
-                        </pic:nvPicPr>
-                        <pic:blipFill>
-                          <a:blip r:embed="rId12"/>
-                          <a:stretch>
-                            <a:fillRect/>
-                          </a:stretch>
-                        </pic:blipFill>
-                        <pic:spPr bwMode="auto">
-                          <a:xfrm>
-                            <a:off x="0" y="0"/>
-                            <a:ext cx="152400" cy="152400"/>
-                          </a:xfrm>
-                          <a:prstGeom prst="rect">
-                            <a:avLst/>
-                          </a:prstGeom>
-                          <a:noFill/>
-                          <a:ln w="9525">
-                            <a:noFill/>
-                            <a:headEnd/>
-                            <a:tailEnd/>
-                          </a:ln>
-                        </pic:spPr>
-                      </pic:pic>
-                    </a:graphicData>
-                  </a:graphic>
-                </wp:inline>
-              </w:drawing>
-            </w:r>
-            <w:r>
-              <w:t xml:space="preserve"> </w:t>
-            </w:r>
-            <w:r>
-              <w:t xml:space="preserve"> </w:t>
-            </w:r>
-            <w:r>
-              <w:t xml:space="preserve">Source</w:t>
-            </w:r>
-          </w:p>
-        </w:tc>
-      </w:tr>
-      <w:tr>
-        <w:trPr>
-          <w:cantSplit/>
-        </w:trPr>
-        <w:tc>
-          <w:tcPr>
-            <w:tcMar>
-              <w:top w:w="108" w:type="dxa"/>
-              <w:bottom w:w="108" w:type="dxa"/>
-            </w:tcMar>
-          </w:tcPr>
-          <w:p>
-            <w:pPr>
-              <w:pStyle w:val="BodyText"/>
-            </w:pPr>
-            <w:pPr>
-              <w:spacing w:before="16" w:after="16"/>
-            </w:pPr>
-            <w:r>
-              <w:t xml:space="preserve">Casella and Berger (2002, sec. 7.3.2)</w:t>
-            </w:r>
-            <w:r>
-              <w:t xml:space="preserve">.</w:t>
-            </w:r>
-          </w:p>
-          <w:p/>
-        </w:tc>
-      </w:tr>
-    </w:tbl>
-    <w:bookmarkEnd w:id="63"/>
-    <w:bookmarkStart w:id="64" w:name="rem-efficient-minimum-variance"/>
+    <w:bookmarkEnd w:id="57"/>
+    <w:bookmarkStart w:id="58" w:name="rem-source-efficient"/>
+    <w:p>
+      <w:pPr>
+        <w:pStyle w:val="FirstParagraph"/>
+      </w:pPr>
+      <w:r>
+        <w:rPr>
+          <w:i/>
+          <w:iCs/>
+        </w:rPr>
+        <w:t xml:space="preserve">Remark 6</w:t>
+      </w:r>
+      <w:r>
+        <w:t xml:space="preserve"> (Source: Efficient estimator). </w:t>
+      </w:r>
+      <w:r>
+        <w:t xml:space="preserve">Casella and Berger (2002, sec. 7.3.2)</w:t>
+      </w:r>
+      <w:r>
+        <w:t xml:space="preserve">.</w:t>
+      </w:r>
+    </w:p>
+    <w:bookmarkEnd w:id="58"/>
+    <w:bookmarkStart w:id="59" w:name="rem-efficient-minimum-variance"/>
     <w:p>
       <w:pPr>
         <w:pStyle w:val="BodyText"/>
@@ -10726,7 +10342,7 @@
           <w:i/>
           <w:iCs/>
         </w:rPr>
-        <w:t xml:space="preserve">Remark 3</w:t>
+        <w:t xml:space="preserve">Remark 7</w:t>
       </w:r>
       <w:r>
         <w:t xml:space="preserve"> (An efficient estimator has the smallest variance). </w:t>
@@ -10752,7 +10368,7 @@
       <w:r>
         <w:t xml:space="preserve">(</w:t>
       </w:r>
-      <w:hyperlink r:id="rId41">
+      <w:hyperlink r:id="rId38">
         <w:r>
           <w:rPr>
             <w:rStyle w:val="Hyperlink"/>
@@ -10764,8 +10380,8 @@
         <w:t xml:space="preserve">, with zero bias).</w:t>
       </w:r>
     </w:p>
-    <w:bookmarkEnd w:id="64"/>
-    <w:bookmarkStart w:id="68" w:name="exm-poisson-efficient"/>
+    <w:bookmarkEnd w:id="59"/>
+    <w:bookmarkStart w:id="63" w:name="exm-poisson-efficient"/>
     <w:p>
       <w:pPr>
         <w:pStyle w:val="BodyText"/>
@@ -10919,7 +10535,7 @@
       <w:r>
         <w:t xml:space="preserve">(</w:t>
       </w:r>
-      <w:hyperlink r:id="rId65">
+      <w:hyperlink r:id="rId60">
         <w:r>
           <w:rPr>
             <w:rStyle w:val="Hyperlink"/>
@@ -11051,7 +10667,7 @@
       <w:r>
         <w:t xml:space="preserve">(</w:t>
       </w:r>
-      <w:hyperlink r:id="rId28">
+      <w:hyperlink r:id="rId26">
         <w:r>
           <w:rPr>
             <w:rStyle w:val="Hyperlink"/>
@@ -11119,7 +10735,7 @@
       <w:r>
         <w:t xml:space="preserve">(</w:t>
       </w:r>
-      <w:hyperlink r:id="rId66">
+      <w:hyperlink r:id="rId61">
         <w:r>
           <w:rPr>
             <w:rStyle w:val="Hyperlink"/>
@@ -11369,7 +10985,7 @@
       <w:r>
         <w:t xml:space="preserve">It is also the maximum likelihood estimator (</w:t>
       </w:r>
-      <w:hyperlink r:id="rId67">
+      <w:hyperlink r:id="rId62">
         <w:r>
           <w:rPr>
             <w:rStyle w:val="Hyperlink"/>
@@ -11381,8 +10997,8 @@
         <w:t xml:space="preserve">).</w:t>
       </w:r>
     </w:p>
-    <w:bookmarkEnd w:id="68"/>
-    <w:bookmarkStart w:id="71" w:name="rem-cramer-rao-scope"/>
+    <w:bookmarkEnd w:id="63"/>
+    <w:bookmarkStart w:id="66" w:name="rem-cramer-rao-scope"/>
     <w:p>
       <w:pPr>
         <w:pStyle w:val="BodyText"/>
@@ -11392,7 +11008,7 @@
           <w:i/>
           <w:iCs/>
         </w:rPr>
-        <w:t xml:space="preserve">Remark 4</w:t>
+        <w:t xml:space="preserve">Remark 8</w:t>
       </w:r>
       <w:r>
         <w:t xml:space="preserve"> (What the bound does and does not say). </w:t>
@@ -11409,7 +11025,7 @@
       <w:r>
         <w:t xml:space="preserve"> </w:t>
       </w:r>
-      <w:hyperlink r:id="rId46">
+      <w:hyperlink r:id="rId43">
         <w:r>
           <w:rPr>
             <w:rStyle w:val="Hyperlink"/>
@@ -11482,7 +11098,7 @@
       <w:r>
         <w:t xml:space="preserve"> </w:t>
       </w:r>
-      <w:hyperlink r:id="rId69">
+      <w:hyperlink r:id="rId64">
         <w:r>
           <w:rPr>
             <w:rStyle w:val="Hyperlink"/>
@@ -11536,7 +11152,7 @@
       <w:r>
         <w:t xml:space="preserve"> </w:t>
       </w:r>
-      <w:hyperlink r:id="rId41">
+      <w:hyperlink r:id="rId38">
         <w:r>
           <w:rPr>
             <w:rStyle w:val="Hyperlink"/>
@@ -11659,7 +11275,7 @@
       <w:r>
         <w:t xml:space="preserve"> </w:t>
       </w:r>
-      <w:hyperlink r:id="rId70">
+      <w:hyperlink r:id="rId65">
         <w:r>
           <w:rPr>
             <w:rStyle w:val="Hyperlink"/>
@@ -11674,9 +11290,9 @@
         <w:t xml:space="preserve">attains it asymptotically.</w:t>
       </w:r>
     </w:p>
-    <w:bookmarkEnd w:id="71"/>
-    <w:bookmarkEnd w:id="72"/>
-    <w:bookmarkStart w:id="80" w:name="references"/>
+    <w:bookmarkEnd w:id="66"/>
+    <w:bookmarkEnd w:id="67"/>
+    <w:bookmarkStart w:id="75" w:name="references"/>
     <w:p>
       <w:pPr>
         <w:pStyle w:val="Heading2"/>
@@ -11685,8 +11301,8 @@
         <w:t xml:space="preserve">References</w:t>
       </w:r>
     </w:p>
-    <w:bookmarkStart w:id="79" w:name="refs"/>
-    <w:bookmarkStart w:id="74" w:name="ref-CaseBerg01"/>
+    <w:bookmarkStart w:id="74" w:name="refs"/>
+    <w:bookmarkStart w:id="69" w:name="ref-CaseBerg01"/>
     <w:p>
       <w:pPr>
         <w:pStyle w:val="Bibliography"/>
@@ -11710,7 +11326,7 @@
       <w:r>
         <w:t xml:space="preserve"> </w:t>
       </w:r>
-      <w:hyperlink r:id="rId73">
+      <w:hyperlink r:id="rId68">
         <w:r>
           <w:rPr>
             <w:rStyle w:val="Hyperlink"/>
@@ -11722,8 +11338,8 @@
         <w:t xml:space="preserve">.</w:t>
       </w:r>
     </w:p>
-    <w:bookmarkEnd w:id="74"/>
-    <w:bookmarkStart w:id="76" w:name="ref-cramer1946mathematical"/>
+    <w:bookmarkEnd w:id="69"/>
+    <w:bookmarkStart w:id="71" w:name="ref-cramer1946mathematical"/>
     <w:p>
       <w:pPr>
         <w:pStyle w:val="Bibliography"/>
@@ -11747,7 +11363,7 @@
       <w:r>
         <w:t xml:space="preserve"> </w:t>
       </w:r>
-      <w:hyperlink r:id="rId75">
+      <w:hyperlink r:id="rId70">
         <w:r>
           <w:rPr>
             <w:rStyle w:val="Hyperlink"/>
@@ -11759,8 +11375,8 @@
         <w:t xml:space="preserve">.</w:t>
       </w:r>
     </w:p>
-    <w:bookmarkEnd w:id="76"/>
-    <w:bookmarkStart w:id="77" w:name="ref-hosmer1989applied"/>
+    <w:bookmarkEnd w:id="71"/>
+    <w:bookmarkStart w:id="72" w:name="ref-hosmer1989applied"/>
     <w:p>
       <w:pPr>
         <w:pStyle w:val="Bibliography"/>
@@ -11782,8 +11398,8 @@
         <w:t xml:space="preserve">. Wiley.</w:t>
       </w:r>
     </w:p>
-    <w:bookmarkEnd w:id="77"/>
-    <w:bookmarkStart w:id="78" w:name="ref-rao1945information"/>
+    <w:bookmarkEnd w:id="72"/>
+    <w:bookmarkStart w:id="73" w:name="ref-rao1945information"/>
     <w:p>
       <w:pPr>
         <w:pStyle w:val="Bibliography"/>
@@ -11814,9 +11430,9 @@
         <w:t xml:space="preserve">37: 81–91.</w:t>
       </w:r>
     </w:p>
-    <w:bookmarkEnd w:id="78"/>
-    <w:bookmarkEnd w:id="79"/>
-    <w:bookmarkEnd w:id="80"/>
+    <w:bookmarkEnd w:id="73"/>
+    <w:bookmarkEnd w:id="74"/>
+    <w:bookmarkEnd w:id="75"/>
     <w:sectPr>
       <w:footnotePr>
         <w:numRestart w:val="eachSect"/>

</xml_diff>

<commit_message>
Deploying to gh-pages from @ Morrison-Lab/sds@16acc3609e8734495fb9cd5911511b83d6604db5 🚀
</commit_message>
<xml_diff>
--- a/estimator-properties-handout.docx
+++ b/estimator-properties-handout.docx
@@ -15,7 +15,7 @@
         <w:pStyle w:val="Date"/>
       </w:pPr>
       <w:r>
-        <w:t xml:space="preserve">Last modified: 2026-10-19 00:31:45 (PDT)</w:t>
+        <w:t xml:space="preserve">Last modified: 2026-10-19 00:48:10 (PDT)</w:t>
       </w:r>
     </w:p>
     <w:p>
@@ -2333,7 +2333,7 @@
         <w:t xml:space="preserve">. </w:t>
       </w:r>
       <w:r>
-        <w:t xml:space="preserve">Fix</w:t>
+        <w:t xml:space="preserve">Let</w:t>
       </w:r>
       <w:r>
         <w:t xml:space="preserve"> </w:t>

</xml_diff>